<commit_message>
Complete initial architecture design and Chapter 4 draft
</commit_message>
<xml_diff>
--- a/docs/reports/colloquium.docx
+++ b/docs/reports/colloquium.docx
@@ -4,7 +4,7 @@
   <w:body>
     <w:p>
       <w:pPr>
-        <w:pStyle w:val="heading30"/>
+        <w:pStyle w:val="Heading31"/>
         <w:jc w:val="center"/>
         <w:rPr>
           <w:sz w:val="36"/>
@@ -16,21 +16,7 @@
           <w:sz w:val="36"/>
           <w:szCs w:val="36"/>
         </w:rPr>
-        <w:t>Design and ASIC Implementation of a Configurable Low</w:t>
-      </w:r>
-      <w:r>
-        <w:rPr>
-          <w:sz w:val="36"/>
-          <w:szCs w:val="36"/>
-        </w:rPr>
-        <w:t xml:space="preserve"> </w:t>
-      </w:r>
-      <w:r>
-        <w:rPr>
-          <w:sz w:val="36"/>
-          <w:szCs w:val="36"/>
-        </w:rPr>
-        <w:t xml:space="preserve">Power </w:t>
+        <w:t xml:space="preserve">Design and ASIC Implementation of a Configurable Low Power </w:t>
       </w:r>
       <w:proofErr w:type="spellStart"/>
       <w:r>
@@ -108,6 +94,15 @@
     </w:p>
     <w:sdt>
       <w:sdtPr>
+        <w:rPr>
+          <w:rFonts w:ascii="Times New Roman" w:eastAsiaTheme="minorHAnsi" w:hAnsi="Times New Roman" w:cstheme="minorBidi"/>
+          <w:color w:val="000000" w:themeColor="text1"/>
+          <w:kern w:val="2"/>
+          <w:sz w:val="24"/>
+          <w:szCs w:val="24"/>
+          <w:lang w:val="en-IN"/>
+          <w14:ligatures w14:val="standardContextual"/>
+        </w:rPr>
         <w:id w:val="719318199"/>
         <w:docPartObj>
           <w:docPartGallery w:val="Table of Contents"/>
@@ -116,16 +111,9 @@
       </w:sdtPr>
       <w:sdtEndPr>
         <w:rPr>
-          <w:rFonts w:ascii="Times New Roman" w:eastAsiaTheme="minorHAnsi" w:hAnsi="Times New Roman" w:cstheme="minorBidi"/>
           <w:b/>
           <w:bCs/>
           <w:noProof/>
-          <w:color w:val="000000" w:themeColor="text1"/>
-          <w:kern w:val="2"/>
-          <w:sz w:val="24"/>
-          <w:szCs w:val="24"/>
-          <w:lang w:val="en-IN"/>
-          <w14:ligatures w14:val="standardContextual"/>
         </w:rPr>
       </w:sdtEndPr>
       <w:sdtContent>
@@ -3469,10 +3457,7 @@
       </w:pPr>
       <w:bookmarkStart w:id="6" w:name="_Toc234935940"/>
       <w:r>
-        <w:t xml:space="preserve">1.2 </w:t>
-      </w:r>
-      <w:r>
-        <w:t>Problem Statement</w:t>
+        <w:t>1.2 Problem Statement</w:t>
       </w:r>
       <w:bookmarkEnd w:id="6"/>
     </w:p>
@@ -3482,10 +3467,7 @@
       </w:pPr>
       <w:bookmarkStart w:id="7" w:name="_Toc234935941"/>
       <w:r>
-        <w:t xml:space="preserve">1.3 </w:t>
-      </w:r>
-      <w:r>
-        <w:t>Objectives</w:t>
+        <w:t>1.3 Objectives</w:t>
       </w:r>
       <w:bookmarkEnd w:id="7"/>
     </w:p>
@@ -3495,10 +3477,7 @@
       </w:pPr>
       <w:bookmarkStart w:id="8" w:name="_Toc234935942"/>
       <w:r>
-        <w:t xml:space="preserve">1.4 </w:t>
-      </w:r>
-      <w:r>
-        <w:t>Scope</w:t>
+        <w:t>1.4 Scope</w:t>
       </w:r>
       <w:bookmarkEnd w:id="8"/>
     </w:p>
@@ -3508,16 +3487,7 @@
       </w:pPr>
       <w:bookmarkStart w:id="9" w:name="_Toc234935943"/>
       <w:r>
-        <w:t xml:space="preserve">1.5 </w:t>
-      </w:r>
-      <w:r>
-        <w:t>C</w:t>
-      </w:r>
-      <w:r>
-        <w:t>o</w:t>
-      </w:r>
-      <w:r>
-        <w:t>ntributions</w:t>
+        <w:t>1.5 Contributions</w:t>
       </w:r>
       <w:bookmarkEnd w:id="9"/>
       <w:r>
@@ -3612,6 +3582,7 @@
       </w:pPr>
       <w:bookmarkStart w:id="17" w:name="_Toc234935951"/>
       <w:r>
+        <w:lastRenderedPageBreak/>
         <w:t>Chapter 3 Literature Review</w:t>
       </w:r>
       <w:bookmarkEnd w:id="17"/>
@@ -3691,6 +3662,20 @@
       <w:bookmarkEnd w:id="23"/>
     </w:p>
     <w:p>
+      <w:r>
+        <w:t xml:space="preserve">This chapter presents the proposed hardware architecture of the </w:t>
+      </w:r>
+      <w:proofErr w:type="spellStart"/>
+      <w:r>
+        <w:t>TinyML</w:t>
+      </w:r>
+      <w:proofErr w:type="spellEnd"/>
+      <w:r>
+        <w:t xml:space="preserve"> systolic array accelerator. The architecture has been designed with the primary objective of enabling efficient matrix multiplication for low-power edge artificial intelligence applications. The proposed system adopts a modular design methodology in which each hardware component performs a dedicated function while interacting with other modules through well-defined interfaces. Such a modular approach simplifies verification, improves scalability, and facilitates future architectural enhancements. The overall architecture consists of an Input Feature Memory, Input Buffer, Weight Buffer, Controller Finite State Machine (FSM), Configurable Processing Element (PE) Array, Accumulator, and Output Feature Memory. Together, these modules form a complete hardware pipeline capable of supporting efficient neural network inference.</w:t>
+      </w:r>
+    </w:p>
+    <w:p/>
+    <w:p>
       <w:pPr>
         <w:pStyle w:val="Heading2"/>
       </w:pPr>
@@ -3703,32 +3688,358 @@
         <w:t xml:space="preserve"> </w:t>
       </w:r>
     </w:p>
+    <w:p/>
+    <w:p>
+      <w:pPr>
+        <w:jc w:val="center"/>
+      </w:pPr>
+      <w:r>
+        <w:rPr>
+          <w:noProof/>
+        </w:rPr>
+        <w:lastRenderedPageBreak/>
+        <w:drawing>
+          <wp:inline distT="0" distB="0" distL="0" distR="0" wp14:anchorId="513088CF" wp14:editId="1F5C60BC">
+            <wp:extent cx="1219200" cy="5097864"/>
+            <wp:effectExtent l="0" t="0" r="0" b="7620"/>
+            <wp:docPr id="1723067741" name="Picture 1"/>
+            <wp:cNvGraphicFramePr>
+              <a:graphicFrameLocks xmlns:a="http://schemas.openxmlformats.org/drawingml/2006/main" noChangeAspect="1"/>
+            </wp:cNvGraphicFramePr>
+            <a:graphic xmlns:a="http://schemas.openxmlformats.org/drawingml/2006/main">
+              <a:graphicData uri="http://schemas.openxmlformats.org/drawingml/2006/picture">
+                <pic:pic xmlns:pic="http://schemas.openxmlformats.org/drawingml/2006/picture">
+                  <pic:nvPicPr>
+                    <pic:cNvPr id="1723067741" name="Picture 1723067741"/>
+                    <pic:cNvPicPr/>
+                  </pic:nvPicPr>
+                  <pic:blipFill>
+                    <a:blip r:embed="rId6">
+                      <a:extLst>
+                        <a:ext uri="{28A0092B-C50C-407E-A947-70E740481C1C}">
+                          <a14:useLocalDpi xmlns:a14="http://schemas.microsoft.com/office/drawing/2010/main" val="0"/>
+                        </a:ext>
+                      </a:extLst>
+                    </a:blip>
+                    <a:stretch>
+                      <a:fillRect/>
+                    </a:stretch>
+                  </pic:blipFill>
+                  <pic:spPr>
+                    <a:xfrm>
+                      <a:off x="0" y="0"/>
+                      <a:ext cx="1219984" cy="5101142"/>
+                    </a:xfrm>
+                    <a:prstGeom prst="rect">
+                      <a:avLst/>
+                    </a:prstGeom>
+                  </pic:spPr>
+                </pic:pic>
+              </a:graphicData>
+            </a:graphic>
+          </wp:inline>
+        </w:drawing>
+      </w:r>
+    </w:p>
+    <w:p>
+      <w:pPr>
+        <w:pStyle w:val="Caption"/>
+        <w:rPr>
+          <w:b/>
+          <w:bCs/>
+        </w:rPr>
+      </w:pPr>
+      <w:r>
+        <w:rPr>
+          <w:b/>
+          <w:bCs/>
+        </w:rPr>
+        <w:t xml:space="preserve">Figure </w:t>
+      </w:r>
+      <w:r>
+        <w:rPr>
+          <w:b/>
+          <w:bCs/>
+        </w:rPr>
+        <w:fldChar w:fldCharType="begin"/>
+      </w:r>
+      <w:r>
+        <w:rPr>
+          <w:b/>
+          <w:bCs/>
+        </w:rPr>
+        <w:instrText xml:space="preserve"> SEQ Figure \* ARABIC </w:instrText>
+      </w:r>
+      <w:r>
+        <w:rPr>
+          <w:b/>
+          <w:bCs/>
+        </w:rPr>
+        <w:fldChar w:fldCharType="separate"/>
+      </w:r>
+      <w:r>
+        <w:rPr>
+          <w:b/>
+          <w:bCs/>
+          <w:noProof/>
+        </w:rPr>
+        <w:t>1</w:t>
+      </w:r>
+      <w:r>
+        <w:rPr>
+          <w:b/>
+          <w:bCs/>
+        </w:rPr>
+        <w:fldChar w:fldCharType="end"/>
+      </w:r>
+      <w:r>
+        <w:rPr>
+          <w:b/>
+          <w:bCs/>
+        </w:rPr>
+        <w:t xml:space="preserve"> Overall Architecture of the Proposed </w:t>
+      </w:r>
+      <w:proofErr w:type="spellStart"/>
+      <w:r>
+        <w:rPr>
+          <w:b/>
+          <w:bCs/>
+        </w:rPr>
+        <w:t>TinyML</w:t>
+      </w:r>
+      <w:proofErr w:type="spellEnd"/>
+      <w:r>
+        <w:rPr>
+          <w:b/>
+          <w:bCs/>
+        </w:rPr>
+        <w:t xml:space="preserve"> Accelerator</w:t>
+      </w:r>
+      <w:r>
+        <w:rPr>
+          <w:b/>
+          <w:bCs/>
+        </w:rPr>
+        <w:t xml:space="preserve">          </w:t>
+      </w:r>
+    </w:p>
+    <w:p>
+      <w:r>
+        <w:t xml:space="preserve">Figure 4.1 illustrates the overall architecture of the proposed </w:t>
+      </w:r>
+      <w:proofErr w:type="spellStart"/>
+      <w:r>
+        <w:t>TinyML</w:t>
+      </w:r>
+      <w:proofErr w:type="spellEnd"/>
+      <w:r>
+        <w:t xml:space="preserve"> systolic array accelerator. The design follows a streaming dataflow architecture in which input activations and neural network weights are supplied to the computation engine through dedicated buffering units. The architecture has been organized into independent functional modules to improve design clarity, simplify verification, and enable future scalability.</w:t>
+      </w:r>
+    </w:p>
+    <w:p>
+      <w:r>
+        <w:t>The computation begins with the Input Feature Memory, which stores the input feature maps generated by the preceding layer of a neural network or received from an external interface. These feature maps are transferred into the Input Buffer, which regulates the flow of activations toward the processing elements while minimizing repeated accesses to external memory.</w:t>
+      </w:r>
+    </w:p>
+    <w:p>
+      <w:r>
+        <w:t>Similarly, neural network weights are stored within the Weight Buffer. Since the same weights are often reused across multiple multiply-accumulate operations, local buffering significantly reduces memory bandwidth requirements and improves computational efficiency.</w:t>
+      </w:r>
+    </w:p>
+    <w:p>
+      <w:r>
+        <w:lastRenderedPageBreak/>
+        <w:t>The Controller FSM acts as the central control unit of the accelerator. It coordinates the loading of feature maps and weights, initiates computation, manages synchronization among the processing elements, and controls the transfer of output data to memory. The controller also governs the execution sequence during different operational phases, including initialization, computation, accumulation, and output storage.</w:t>
+      </w:r>
+    </w:p>
+    <w:p>
+      <w:r>
+        <w:t xml:space="preserve">The Configurable Processing Element Array forms the computational core of the proposed accelerator. The PE array performs highly parallel multiply-accumulate operations by allowing data to propagate through </w:t>
+      </w:r>
+      <w:proofErr w:type="spellStart"/>
+      <w:r>
+        <w:t>neighboring</w:t>
+      </w:r>
+      <w:proofErr w:type="spellEnd"/>
+      <w:r>
+        <w:t xml:space="preserve"> processing elements in a systolic manner. Such data reuse minimizes external memory accesses while maximizing computational throughput.</w:t>
+      </w:r>
+    </w:p>
+    <w:p>
+      <w:r>
+        <w:t>The partial sums generated by the PE array are collected by the Accumulator module. After all required MAC operations have been completed, the accumulated outputs are transferred to the Output Feature Memory, where they are stored before being forwarded to subsequent neural network layers or external memory.</w:t>
+      </w:r>
+    </w:p>
+    <w:p>
+      <w:r>
+        <w:t>Owing to its modular organization, the proposed architecture can be extended to larger systolic arrays without requiring major modifications to the overall system design. This scalability forms an important characteristic of the proposed hardware accelerator.</w:t>
+      </w:r>
+    </w:p>
+    <w:p/>
     <w:p>
       <w:pPr>
         <w:pStyle w:val="Heading2"/>
       </w:pPr>
       <w:bookmarkStart w:id="25" w:name="_Toc234935959"/>
       <w:r>
+        <w:lastRenderedPageBreak/>
         <w:t>4.2 Processing Element</w:t>
       </w:r>
+      <w:bookmarkStart w:id="26" w:name="_Toc234935960"/>
       <w:bookmarkEnd w:id="25"/>
     </w:p>
     <w:p>
       <w:pPr>
+        <w:jc w:val="center"/>
+      </w:pPr>
+      <w:r>
+        <w:rPr>
+          <w:noProof/>
+        </w:rPr>
+        <w:drawing>
+          <wp:inline distT="0" distB="0" distL="0" distR="0" wp14:anchorId="029D251B" wp14:editId="43A7B93B">
+            <wp:extent cx="4667250" cy="7724775"/>
+            <wp:effectExtent l="0" t="0" r="0" b="9525"/>
+            <wp:docPr id="23110725" name="Picture 4"/>
+            <wp:cNvGraphicFramePr>
+              <a:graphicFrameLocks xmlns:a="http://schemas.openxmlformats.org/drawingml/2006/main" noChangeAspect="1"/>
+            </wp:cNvGraphicFramePr>
+            <a:graphic xmlns:a="http://schemas.openxmlformats.org/drawingml/2006/main">
+              <a:graphicData uri="http://schemas.openxmlformats.org/drawingml/2006/picture">
+                <pic:pic xmlns:pic="http://schemas.openxmlformats.org/drawingml/2006/picture">
+                  <pic:nvPicPr>
+                    <pic:cNvPr id="23110725" name="Picture 23110725"/>
+                    <pic:cNvPicPr/>
+                  </pic:nvPicPr>
+                  <pic:blipFill>
+                    <a:blip r:embed="rId7">
+                      <a:extLst>
+                        <a:ext uri="{28A0092B-C50C-407E-A947-70E740481C1C}">
+                          <a14:useLocalDpi xmlns:a14="http://schemas.microsoft.com/office/drawing/2010/main" val="0"/>
+                        </a:ext>
+                      </a:extLst>
+                    </a:blip>
+                    <a:stretch>
+                      <a:fillRect/>
+                    </a:stretch>
+                  </pic:blipFill>
+                  <pic:spPr>
+                    <a:xfrm>
+                      <a:off x="0" y="0"/>
+                      <a:ext cx="4667250" cy="7724775"/>
+                    </a:xfrm>
+                    <a:prstGeom prst="rect">
+                      <a:avLst/>
+                    </a:prstGeom>
+                  </pic:spPr>
+                </pic:pic>
+              </a:graphicData>
+            </a:graphic>
+          </wp:inline>
+        </w:drawing>
+      </w:r>
+    </w:p>
+    <w:p>
+      <w:pPr>
+        <w:pStyle w:val="Caption"/>
+        <w:rPr>
+          <w:b/>
+          <w:bCs/>
+        </w:rPr>
+      </w:pPr>
+      <w:r>
+        <w:rPr>
+          <w:b/>
+          <w:bCs/>
+        </w:rPr>
+        <w:t xml:space="preserve">Figure </w:t>
+      </w:r>
+      <w:r>
+        <w:rPr>
+          <w:b/>
+          <w:bCs/>
+        </w:rPr>
+        <w:fldChar w:fldCharType="begin"/>
+      </w:r>
+      <w:r>
+        <w:rPr>
+          <w:b/>
+          <w:bCs/>
+        </w:rPr>
+        <w:instrText xml:space="preserve"> SEQ Figure \* ARABIC </w:instrText>
+      </w:r>
+      <w:r>
+        <w:rPr>
+          <w:b/>
+          <w:bCs/>
+        </w:rPr>
+        <w:fldChar w:fldCharType="separate"/>
+      </w:r>
+      <w:r>
+        <w:rPr>
+          <w:b/>
+          <w:bCs/>
+          <w:noProof/>
+        </w:rPr>
+        <w:t>2</w:t>
+      </w:r>
+      <w:r>
+        <w:rPr>
+          <w:b/>
+          <w:bCs/>
+        </w:rPr>
+        <w:fldChar w:fldCharType="end"/>
+      </w:r>
+      <w:r>
+        <w:rPr>
+          <w:b/>
+          <w:bCs/>
+        </w:rPr>
+        <w:t xml:space="preserve"> Processing Element Architecture</w:t>
+      </w:r>
+      <w:bookmarkEnd w:id="26"/>
+    </w:p>
+    <w:p>
+      <w:r>
+        <w:lastRenderedPageBreak/>
+        <w:t>The Processing Element (PE) represents the fundamental computational unit of the proposed systolic array accelerator. Every matrix multiplication performed by the accelerator is ultimately decomposed into numerous multiply-accumulate operations executed independently by individual processing elements. Consequently, the overall performance of the accelerator is primarily determined by the efficiency of the PE design.</w:t>
+      </w:r>
+    </w:p>
+    <w:p>
+      <w:r>
+        <w:t>The proposed Processing Element consists of dedicated input registers, a multiplier, an adder, an accumulator register, and forwarding paths for feature data and weights. Input registers temporarily store incoming operands before computation, thereby synchronizing data movement with the system clock and improving timing stability.</w:t>
+      </w:r>
+    </w:p>
+    <w:p>
+      <w:r>
+        <w:t>The multiplier computes the product of the incoming activation and corresponding weight. The resulting product is immediately supplied to the adder, where it is combined with the previously accumulated partial sum. The updated partial sum is then stored inside the accumulator register for use during subsequent computation cycles.</w:t>
+      </w:r>
+    </w:p>
+    <w:p>
+      <w:r>
+        <w:t xml:space="preserve">Unlike conventional processing architectures in which operands are repeatedly fetched from memory, the proposed PE forwards feature values and weights to </w:t>
+      </w:r>
+      <w:proofErr w:type="spellStart"/>
+      <w:r>
+        <w:t>neighboring</w:t>
+      </w:r>
+      <w:proofErr w:type="spellEnd"/>
+      <w:r>
+        <w:t xml:space="preserve"> processing elements. This local communication mechanism forms the basis of systolic computation and substantially reduces external memory traffic while improving energy efficiency.</w:t>
+      </w:r>
+    </w:p>
+    <w:p>
+      <w:r>
+        <w:t>Since all processing elements operate concurrently, the PE array is capable of performing a large number of multiply-accumulate operations every clock cycle. Such parallel execution significantly improves throughput for neural network inference workloads while maintaining a relatively simple hardware structure.</w:t>
+      </w:r>
+    </w:p>
+    <w:p>
+      <w:pPr>
         <w:pStyle w:val="Heading2"/>
       </w:pPr>
-      <w:bookmarkStart w:id="26" w:name="_Toc234935960"/>
-      <w:r>
-        <w:t>4.3 Multiply-Accumulate Unit</w:t>
-      </w:r>
-      <w:bookmarkEnd w:id="26"/>
-    </w:p>
-    <w:p>
-      <w:pPr>
-        <w:pStyle w:val="Heading2"/>
-      </w:pPr>
       <w:bookmarkStart w:id="27" w:name="_Toc234935961"/>
       <w:r>
+        <w:lastRenderedPageBreak/>
         <w:t>4.4 Input Buffer</w:t>
       </w:r>
       <w:bookmarkEnd w:id="27"/>
@@ -5151,8 +5462,8 @@
       <w:spacing w:val="5"/>
     </w:rPr>
   </w:style>
-  <w:style w:type="paragraph" w:customStyle="1" w:styleId="heading30">
-    <w:name w:val="heading 3"/>
+  <w:style w:type="paragraph" w:customStyle="1" w:styleId="Heading31">
+    <w:name w:val="Heading 31"/>
     <w:basedOn w:val="Normal"/>
     <w:next w:val="Heading3"/>
     <w:qFormat/>
@@ -5232,7 +5543,6 @@
     <w:basedOn w:val="Normal"/>
     <w:next w:val="Normal"/>
     <w:uiPriority w:val="35"/>
-    <w:semiHidden/>
     <w:unhideWhenUsed/>
     <w:qFormat/>
     <w:rsid w:val="005D0B75"/>

</xml_diff>